<commit_message>
building chapter 5 and 6
</commit_message>
<xml_diff>
--- a/Report Draft/References-Consolidated.docx
+++ b/Report Draft/References-Consolidated.docx
@@ -553,26 +553,17 @@
         <w:t xml:space="preserve">33</w:t>
       </w:r>
       <w:r>
-        <w:t xml:space="preserve">(5), pp.2223-2273.</w:t>
-      </w:r>
-    </w:p>
-    <w:p>
-      <w:pPr>
-        <w:spacing w:line="360" w:lineRule="auto"/>
-        <w:ind w:left="567" w:hanging="567"/>
-        <w:jc w:val="left"/>
-      </w:pPr>
-      <w:r>
-        <w:t xml:space="preserve">Guidolin, M. (2011) 'Markov switching models in empirical finance', in Drukker, D.M. (ed.) </w:t>
-      </w:r>
-      <w:r>
-        <w:rPr>
-          <w:i/>
-        </w:rPr>
-        <w:t xml:space="preserve">Missing Data Methods: Time-Series Methods and Applications</w:t>
-      </w:r>
-      <w:r>
-        <w:t xml:space="preserve"> (Advances in Econometrics, Vol. 27, Part B). Bingley: Emerald Group Publishing, pp. 1–86.</w:t>
+        <w:t xml:space="preserve">(5), pp.2223–2273.</w:t>
+      </w:r>
+    </w:p>
+    <w:p>
+      <w:pPr>
+        <w:spacing w:line="360" w:lineRule="auto"/>
+        <w:ind w:left="567" w:hanging="567"/>
+        <w:jc w:val="left"/>
+      </w:pPr>
+      <w:r>
+        <w:t xml:space="preserve">Guidolin, M., 2011. Markov switching models in empirical finance. In: D.M. Drukker, ed. Missing Data Methods: Time-Series Methods and Applications (Advances in Econometrics, Vol. 27, Part B). Bingley: Emerald Group Publishing, pp.1–86.</w:t>
       </w:r>
     </w:p>
     <w:p>
@@ -915,16 +906,7 @@
         <w:jc w:val="left"/>
       </w:pPr>
       <w:r>
-        <w:t xml:space="preserve">Lim, B. and Zohren, S., 2021. Time-series forecasting with deep learning: a survey. </w:t>
-      </w:r>
-      <w:r>
-        <w:rPr>
-          <w:i/>
-        </w:rPr>
-        <w:t xml:space="preserve">Philosophical Transactions of the Royal Society A</w:t>
-      </w:r>
-      <w:r>
-        <w:t xml:space="preserve">, 379(2194), 20200209. </w:t>
+        <w:t xml:space="preserve">Lim, B. and Zohren, S., 2021. Time-series forecasting with deep learning: a survey. Philosophical Transactions of the Royal Society A, 379(2194), 20200209. https://doi.org/10.1098/rsta.2020.0209</w:t>
       </w:r>
     </w:p>
     <w:p>
@@ -990,7 +972,7 @@
         <w:t xml:space="preserve">36</w:t>
       </w:r>
       <w:r>
-        <w:t xml:space="preserve">(1), pp.54-74.</w:t>
+        <w:t xml:space="preserve">(1), pp.54–74.</w:t>
       </w:r>
     </w:p>
     <w:p>

</xml_diff>